<commit_message>
FD01 FD02 FD02 update
</commit_message>
<xml_diff>
--- a/FD01-EPIS-Informe de Factibilidad.docx
+++ b/FD01-EPIS-Informe de Factibilidad.docx
@@ -1667,7 +1667,7 @@
                 <w:szCs w:val="14"/>
                 <w:rtl w:val="0"/>
               </w:rPr>
-              <w:t xml:space="preserve">2.0</w:t>
+              <w:t xml:space="preserve">1.0</w:t>
             </w:r>
             <w:r>
               <w:rPr>
@@ -1716,7 +1716,7 @@
                 <w:szCs w:val="14"/>
                 <w:rtl w:val="0"/>
               </w:rPr>
-              <w:t xml:space="preserve">JME, CQC, RPC,NSI</w:t>
+              <w:t xml:space="preserve">NS, JJRI</w:t>
             </w:r>
             <w:r>
               <w:rPr>
@@ -1863,7 +1863,7 @@
                 <w:szCs w:val="14"/>
                 <w:rtl w:val="0"/>
               </w:rPr>
-              <w:t xml:space="preserve">28/11/2025</w:t>
+              <w:t xml:space="preserve">05/04/2025</w:t>
             </w:r>
             <w:r>
               <w:rPr>
@@ -1912,7 +1912,7 @@
                 <w:szCs w:val="14"/>
                 <w:rtl w:val="0"/>
               </w:rPr>
-              <w:t xml:space="preserve">Versión 2</w:t>
+              <w:t xml:space="preserve">Versión 1</w:t>
             </w:r>
             <w:r>
               <w:rPr>
@@ -2078,7 +2078,7 @@
     </w:p>
     <w:sdt>
       <w:sdtPr>
-        <w:id w:val="-1218219450"/>
+        <w:id w:val="-1244065710"/>
         <w:docPartObj>
           <w:docPartGallery w:val="Table of Contents"/>
           <w:docPartUnique w:val="1"/>
@@ -2790,9 +2790,8 @@
         <w:ind w:left="720" w:right="0" w:hanging="360"/>
         <w:jc w:val="both"/>
         <w:rPr>
-          <w:rFonts w:ascii="Calibri" w:cs="Calibri" w:eastAsia="Calibri" w:hAnsi="Calibri"/>
-          <w:b w:val="0"/>
-          <w:bCs w:val="0"/>
+          <w:b w:val="1"/>
+          <w:bCs w:val="1"/>
           <w:i w:val="0"/>
           <w:iCs w:val="0"/>
           <w:smallCaps w:val="0"/>
@@ -2800,7 +2799,6 @@
           <w:color w:val="000000"/>
           <w:sz w:val="24"/>
           <w:szCs w:val="24"/>
-          <w:u w:val="none"/>
           <w:shd w:fill="auto" w:val="clear"/>
           <w:vertAlign w:val="baseline"/>
         </w:rPr>
@@ -2809,9 +2807,8 @@
       <w:bookmarkEnd w:id="0"/>
       <w:r>
         <w:rPr>
-          <w:rFonts w:ascii="Calibri" w:cs="Calibri" w:eastAsia="Calibri" w:hAnsi="Calibri"/>
-          <w:b w:val="0"/>
-          <w:bCs w:val="0"/>
+          <w:b w:val="1"/>
+          <w:bCs w:val="1"/>
           <w:i w:val="0"/>
           <w:iCs w:val="0"/>
           <w:smallCaps w:val="0"/>
@@ -2840,12 +2837,16 @@
         <w:ind w:left="1440" w:hanging="360"/>
         <w:jc w:val="both"/>
         <w:rPr>
-          <w:sz w:val="24"/>
-          <w:szCs w:val="24"/>
-        </w:rPr>
-      </w:pPr>
-      <w:r>
-        <w:rPr>
+          <w:b w:val="1"/>
+          <w:bCs w:val="1"/>
+          <w:sz w:val="24"/>
+          <w:szCs w:val="24"/>
+        </w:rPr>
+      </w:pPr>
+      <w:r>
+        <w:rPr>
+          <w:b w:val="1"/>
+          <w:bCs w:val="1"/>
           <w:i w:val="0"/>
           <w:iCs w:val="0"/>
           <w:smallCaps w:val="0"/>
@@ -2901,12 +2902,16 @@
         <w:ind w:left="1440" w:hanging="360"/>
         <w:jc w:val="both"/>
         <w:rPr>
-          <w:sz w:val="24"/>
-          <w:szCs w:val="24"/>
-        </w:rPr>
-      </w:pPr>
-      <w:r>
-        <w:rPr>
+          <w:b w:val="1"/>
+          <w:bCs w:val="1"/>
+          <w:sz w:val="24"/>
+          <w:szCs w:val="24"/>
+        </w:rPr>
+      </w:pPr>
+      <w:r>
+        <w:rPr>
+          <w:b w:val="1"/>
+          <w:bCs w:val="1"/>
           <w:sz w:val="24"/>
           <w:szCs w:val="24"/>
           <w:rtl w:val="0"/>
@@ -2949,12 +2954,16 @@
         <w:ind w:left="1440" w:hanging="360"/>
         <w:jc w:val="both"/>
         <w:rPr>
-          <w:sz w:val="24"/>
-          <w:szCs w:val="24"/>
-        </w:rPr>
-      </w:pPr>
-      <w:r>
-        <w:rPr>
+          <w:b w:val="1"/>
+          <w:bCs w:val="1"/>
+          <w:sz w:val="24"/>
+          <w:szCs w:val="24"/>
+        </w:rPr>
+      </w:pPr>
+      <w:r>
+        <w:rPr>
+          <w:b w:val="1"/>
+          <w:bCs w:val="1"/>
           <w:sz w:val="24"/>
           <w:szCs w:val="24"/>
           <w:rtl w:val="0"/>
@@ -2993,6 +3002,8 @@
         <w:ind w:left="1440" w:firstLine="0"/>
         <w:jc w:val="both"/>
         <w:rPr>
+          <w:b w:val="1"/>
+          <w:bCs w:val="1"/>
           <w:sz w:val="24"/>
           <w:szCs w:val="24"/>
         </w:rPr>
@@ -3016,12 +3027,16 @@
         <w:ind w:left="1440" w:hanging="360"/>
         <w:jc w:val="both"/>
         <w:rPr>
-          <w:sz w:val="24"/>
-          <w:szCs w:val="24"/>
-        </w:rPr>
-      </w:pPr>
-      <w:r>
-        <w:rPr>
+          <w:b w:val="1"/>
+          <w:bCs w:val="1"/>
+          <w:sz w:val="24"/>
+          <w:szCs w:val="24"/>
+        </w:rPr>
+      </w:pPr>
+      <w:r>
+        <w:rPr>
+          <w:b w:val="1"/>
+          <w:bCs w:val="1"/>
           <w:sz w:val="24"/>
           <w:szCs w:val="24"/>
           <w:rtl w:val="0"/>
@@ -3042,12 +3057,16 @@
         <w:ind w:left="2160" w:hanging="360"/>
         <w:jc w:val="both"/>
         <w:rPr>
-          <w:sz w:val="24"/>
-          <w:szCs w:val="24"/>
-        </w:rPr>
-      </w:pPr>
-      <w:r>
-        <w:rPr>
+          <w:b w:val="1"/>
+          <w:bCs w:val="1"/>
+          <w:sz w:val="24"/>
+          <w:szCs w:val="24"/>
+        </w:rPr>
+      </w:pPr>
+      <w:r>
+        <w:rPr>
+          <w:b w:val="1"/>
+          <w:bCs w:val="1"/>
           <w:sz w:val="24"/>
           <w:szCs w:val="24"/>
           <w:rtl w:val="0"/>
@@ -3090,12 +3109,16 @@
         <w:ind w:left="2160" w:hanging="360"/>
         <w:jc w:val="both"/>
         <w:rPr>
-          <w:sz w:val="24"/>
-          <w:szCs w:val="24"/>
-        </w:rPr>
-      </w:pPr>
-      <w:r>
-        <w:rPr>
+          <w:b w:val="1"/>
+          <w:bCs w:val="1"/>
+          <w:sz w:val="24"/>
+          <w:szCs w:val="24"/>
+        </w:rPr>
+      </w:pPr>
+      <w:r>
+        <w:rPr>
+          <w:b w:val="1"/>
+          <w:bCs w:val="1"/>
           <w:sz w:val="24"/>
           <w:szCs w:val="24"/>
           <w:rtl w:val="0"/>
@@ -3277,9 +3300,8 @@
         <w:ind w:left="720" w:right="0" w:hanging="360"/>
         <w:jc w:val="both"/>
         <w:rPr>
-          <w:rFonts w:ascii="Calibri" w:cs="Calibri" w:eastAsia="Calibri" w:hAnsi="Calibri"/>
-          <w:b w:val="0"/>
-          <w:bCs w:val="0"/>
+          <w:b w:val="1"/>
+          <w:bCs w:val="1"/>
           <w:i w:val="0"/>
           <w:iCs w:val="0"/>
           <w:smallCaps w:val="0"/>
@@ -3287,7 +3309,6 @@
           <w:color w:val="000000"/>
           <w:sz w:val="24"/>
           <w:szCs w:val="24"/>
-          <w:u w:val="none"/>
           <w:shd w:fill="auto" w:val="clear"/>
           <w:vertAlign w:val="baseline"/>
         </w:rPr>
@@ -3296,9 +3317,8 @@
       <w:bookmarkEnd w:id="1"/>
       <w:r>
         <w:rPr>
-          <w:rFonts w:ascii="Calibri" w:cs="Calibri" w:eastAsia="Calibri" w:hAnsi="Calibri"/>
-          <w:b w:val="0"/>
-          <w:bCs w:val="0"/>
+          <w:b w:val="1"/>
+          <w:bCs w:val="1"/>
           <w:i w:val="0"/>
           <w:iCs w:val="0"/>
           <w:smallCaps w:val="0"/>
@@ -3436,9 +3456,8 @@
         <w:ind w:left="720" w:right="0" w:hanging="360"/>
         <w:jc w:val="both"/>
         <w:rPr>
-          <w:rFonts w:ascii="Calibri" w:cs="Calibri" w:eastAsia="Calibri" w:hAnsi="Calibri"/>
-          <w:b w:val="0"/>
-          <w:bCs w:val="0"/>
+          <w:b w:val="1"/>
+          <w:bCs w:val="1"/>
           <w:i w:val="0"/>
           <w:iCs w:val="0"/>
           <w:smallCaps w:val="0"/>
@@ -3446,7 +3465,6 @@
           <w:color w:val="000000"/>
           <w:sz w:val="24"/>
           <w:szCs w:val="24"/>
-          <w:u w:val="none"/>
           <w:shd w:fill="auto" w:val="clear"/>
           <w:vertAlign w:val="baseline"/>
         </w:rPr>
@@ -3455,9 +3473,8 @@
       <w:bookmarkEnd w:id="2"/>
       <w:r>
         <w:rPr>
-          <w:rFonts w:ascii="Calibri" w:cs="Calibri" w:eastAsia="Calibri" w:hAnsi="Calibri"/>
-          <w:b w:val="0"/>
-          <w:bCs w:val="0"/>
+          <w:b w:val="1"/>
+          <w:bCs w:val="1"/>
           <w:i w:val="0"/>
           <w:iCs w:val="0"/>
           <w:smallCaps w:val="0"/>
@@ -3486,12 +3503,16 @@
         <w:ind w:left="1440" w:hanging="360"/>
         <w:jc w:val="both"/>
         <w:rPr>
-          <w:sz w:val="24"/>
-          <w:szCs w:val="24"/>
-        </w:rPr>
-      </w:pPr>
-      <w:r>
-        <w:rPr>
+          <w:b w:val="1"/>
+          <w:bCs w:val="1"/>
+          <w:sz w:val="24"/>
+          <w:szCs w:val="24"/>
+        </w:rPr>
+      </w:pPr>
+      <w:r>
+        <w:rPr>
+          <w:b w:val="1"/>
+          <w:bCs w:val="1"/>
           <w:sz w:val="24"/>
           <w:szCs w:val="24"/>
           <w:rtl w:val="0"/>
@@ -3619,12 +3640,16 @@
         <w:ind w:left="1440" w:hanging="360"/>
         <w:jc w:val="both"/>
         <w:rPr>
-          <w:sz w:val="24"/>
-          <w:szCs w:val="24"/>
-        </w:rPr>
-      </w:pPr>
-      <w:r>
-        <w:rPr>
+          <w:b w:val="1"/>
+          <w:bCs w:val="1"/>
+          <w:sz w:val="24"/>
+          <w:szCs w:val="24"/>
+        </w:rPr>
+      </w:pPr>
+      <w:r>
+        <w:rPr>
+          <w:b w:val="1"/>
+          <w:bCs w:val="1"/>
           <w:sz w:val="24"/>
           <w:szCs w:val="24"/>
           <w:rtl w:val="0"/>
@@ -3651,7 +3676,7 @@
           <w:szCs w:val="24"/>
           <w:rtl w:val="0"/>
         </w:rPr>
-        <w:t xml:space="preserve">Actualmente no se cuenta con computadoras para hospedar el sitio web, para garantizar el funcionamiento eficiente del Sistema Integral de Gestión y Diagnóstico Médico, se requiere disponer de al menos 2 servidores en la nube, en cuanto a las estaciones de trabajo y la necesidades del sistema se tiene lo siguiente. </w:t>
+        <w:t xml:space="preserve">Actualmente no se cuenta con computadoras para hospedar el sitio web, para garantizar el funcionamiento eficiente del Sistema de monitoreo de métricas de proyectos. Para ello, se requerirán estaciones de trabajo con conexión a internet y navegadores web actualizados, permitiendo el acceso concurrente de los diferentes usuarios del sistema, tales como gestores de proyectos, miembros del equipo de desarrollo, usuarios generales y administradores de la plataforma.</w:t>
       </w:r>
     </w:p>
     <w:p>
@@ -3710,7 +3735,7 @@
           <w:szCs w:val="24"/>
           <w:rtl w:val="0"/>
         </w:rPr>
-        <w:t xml:space="preserve">Procesador: Ryzen 5 5600 o equivalente.</w:t>
+        <w:t xml:space="preserve">Procesador: Ryzen 5 5600X o equivalente.</w:t>
       </w:r>
       <w:r>
         <w:rPr>
@@ -4244,9 +4269,8 @@
         <w:ind w:left="720" w:right="0" w:hanging="360"/>
         <w:jc w:val="both"/>
         <w:rPr>
-          <w:rFonts w:ascii="Calibri" w:cs="Calibri" w:eastAsia="Calibri" w:hAnsi="Calibri"/>
-          <w:b w:val="0"/>
-          <w:bCs w:val="0"/>
+          <w:b w:val="1"/>
+          <w:bCs w:val="1"/>
           <w:i w:val="0"/>
           <w:iCs w:val="0"/>
           <w:smallCaps w:val="0"/>
@@ -4254,7 +4278,6 @@
           <w:color w:val="000000"/>
           <w:sz w:val="24"/>
           <w:szCs w:val="24"/>
-          <w:u w:val="none"/>
           <w:shd w:fill="auto" w:val="clear"/>
           <w:vertAlign w:val="baseline"/>
         </w:rPr>
@@ -4263,9 +4286,8 @@
       <w:bookmarkEnd w:id="3"/>
       <w:r>
         <w:rPr>
-          <w:rFonts w:ascii="Calibri" w:cs="Calibri" w:eastAsia="Calibri" w:hAnsi="Calibri"/>
-          <w:b w:val="0"/>
-          <w:bCs w:val="0"/>
+          <w:b w:val="1"/>
+          <w:bCs w:val="1"/>
           <w:i w:val="0"/>
           <w:iCs w:val="0"/>
           <w:smallCaps w:val="0"/>
@@ -4306,9 +4328,8 @@
         <w:ind w:left="1440" w:right="0" w:hanging="360"/>
         <w:jc w:val="both"/>
         <w:rPr>
-          <w:rFonts w:ascii="Calibri" w:cs="Calibri" w:eastAsia="Calibri" w:hAnsi="Calibri"/>
-          <w:b w:val="0"/>
-          <w:bCs w:val="0"/>
+          <w:b w:val="1"/>
+          <w:bCs w:val="1"/>
           <w:i w:val="0"/>
           <w:iCs w:val="0"/>
           <w:smallCaps w:val="0"/>
@@ -4316,7 +4337,6 @@
           <w:color w:val="000000"/>
           <w:sz w:val="24"/>
           <w:szCs w:val="24"/>
-          <w:u w:val="none"/>
           <w:shd w:fill="auto" w:val="clear"/>
           <w:vertAlign w:val="baseline"/>
         </w:rPr>
@@ -4325,9 +4345,8 @@
       <w:bookmarkEnd w:id="4"/>
       <w:r>
         <w:rPr>
-          <w:rFonts w:ascii="Calibri" w:cs="Calibri" w:eastAsia="Calibri" w:hAnsi="Calibri"/>
-          <w:b w:val="0"/>
-          <w:bCs w:val="0"/>
+          <w:b w:val="1"/>
+          <w:bCs w:val="1"/>
           <w:i w:val="0"/>
           <w:iCs w:val="0"/>
           <w:smallCaps w:val="0"/>
@@ -4651,9 +4670,8 @@
         <w:ind w:left="1440" w:right="0" w:hanging="360"/>
         <w:jc w:val="both"/>
         <w:rPr>
-          <w:rFonts w:ascii="Calibri" w:cs="Calibri" w:eastAsia="Calibri" w:hAnsi="Calibri"/>
-          <w:b w:val="0"/>
-          <w:bCs w:val="0"/>
+          <w:b w:val="1"/>
+          <w:bCs w:val="1"/>
           <w:i w:val="0"/>
           <w:iCs w:val="0"/>
           <w:smallCaps w:val="0"/>
@@ -4661,7 +4679,6 @@
           <w:color w:val="000000"/>
           <w:sz w:val="24"/>
           <w:szCs w:val="24"/>
-          <w:u w:val="none"/>
           <w:shd w:fill="auto" w:val="clear"/>
           <w:vertAlign w:val="baseline"/>
         </w:rPr>
@@ -4670,9 +4687,8 @@
       <w:bookmarkEnd w:id="5"/>
       <w:r>
         <w:rPr>
-          <w:rFonts w:ascii="Calibri" w:cs="Calibri" w:eastAsia="Calibri" w:hAnsi="Calibri"/>
-          <w:b w:val="0"/>
-          <w:bCs w:val="0"/>
+          <w:b w:val="1"/>
+          <w:bCs w:val="1"/>
           <w:i w:val="0"/>
           <w:iCs w:val="0"/>
           <w:smallCaps w:val="0"/>
@@ -4701,12 +4717,16 @@
         <w:ind w:left="2160" w:hanging="360"/>
         <w:jc w:val="both"/>
         <w:rPr>
-          <w:sz w:val="24"/>
-          <w:szCs w:val="24"/>
-        </w:rPr>
-      </w:pPr>
-      <w:r>
-        <w:rPr>
+          <w:b w:val="1"/>
+          <w:bCs w:val="1"/>
+          <w:sz w:val="24"/>
+          <w:szCs w:val="24"/>
+        </w:rPr>
+      </w:pPr>
+      <w:r>
+        <w:rPr>
+          <w:b w:val="1"/>
+          <w:bCs w:val="1"/>
           <w:sz w:val="24"/>
           <w:szCs w:val="24"/>
           <w:rtl w:val="0"/>
@@ -5143,12 +5163,16 @@
         <w:ind w:left="2160" w:hanging="360"/>
         <w:jc w:val="both"/>
         <w:rPr>
-          <w:sz w:val="24"/>
-          <w:szCs w:val="24"/>
-        </w:rPr>
-      </w:pPr>
-      <w:r>
-        <w:rPr>
+          <w:b w:val="1"/>
+          <w:bCs w:val="1"/>
+          <w:sz w:val="24"/>
+          <w:szCs w:val="24"/>
+        </w:rPr>
+      </w:pPr>
+      <w:r>
+        <w:rPr>
+          <w:b w:val="1"/>
+          <w:bCs w:val="1"/>
           <w:sz w:val="24"/>
           <w:szCs w:val="24"/>
           <w:rtl w:val="0"/>
@@ -5207,7 +5231,7 @@
     <w:sdt>
       <w:sdtPr>
         <w:lock w:val="contentLocked"/>
-        <w:id w:val="-1590525905"/>
+        <w:id w:val="-629848942"/>
         <w:tag w:val="goog_rdk_0"/>
       </w:sdtPr>
       <w:sdtContent>
@@ -5518,12 +5542,16 @@
         <w:ind w:left="2160" w:hanging="360"/>
         <w:jc w:val="both"/>
         <w:rPr>
-          <w:sz w:val="24"/>
-          <w:szCs w:val="24"/>
-        </w:rPr>
-      </w:pPr>
-      <w:r>
-        <w:rPr>
+          <w:b w:val="1"/>
+          <w:bCs w:val="1"/>
+          <w:sz w:val="24"/>
+          <w:szCs w:val="24"/>
+        </w:rPr>
+      </w:pPr>
+      <w:r>
+        <w:rPr>
+          <w:b w:val="1"/>
+          <w:bCs w:val="1"/>
           <w:sz w:val="24"/>
           <w:szCs w:val="24"/>
           <w:rtl w:val="0"/>
@@ -5534,7 +5562,7 @@
     <w:sdt>
       <w:sdtPr>
         <w:lock w:val="contentLocked"/>
-        <w:id w:val="946971929"/>
+        <w:id w:val="1997115616"/>
         <w:tag w:val="goog_rdk_1"/>
       </w:sdtPr>
       <w:sdtContent>
@@ -5913,12 +5941,16 @@
         <w:ind w:left="2160" w:hanging="360"/>
         <w:jc w:val="both"/>
         <w:rPr>
-          <w:sz w:val="24"/>
-          <w:szCs w:val="24"/>
-        </w:rPr>
-      </w:pPr>
-      <w:r>
-        <w:rPr>
+          <w:b w:val="1"/>
+          <w:bCs w:val="1"/>
+          <w:sz w:val="24"/>
+          <w:szCs w:val="24"/>
+        </w:rPr>
+      </w:pPr>
+      <w:r>
+        <w:rPr>
+          <w:b w:val="1"/>
+          <w:bCs w:val="1"/>
           <w:sz w:val="24"/>
           <w:szCs w:val="24"/>
           <w:rtl w:val="0"/>
@@ -5957,7 +5989,7 @@
     <w:sdt>
       <w:sdtPr>
         <w:lock w:val="contentLocked"/>
-        <w:id w:val="1638619832"/>
+        <w:id w:val="-1703442351"/>
         <w:tag w:val="goog_rdk_2"/>
       </w:sdtPr>
       <w:sdtContent>
@@ -6556,12 +6588,16 @@
         <w:ind w:left="2160" w:hanging="360"/>
         <w:jc w:val="both"/>
         <w:rPr>
-          <w:sz w:val="24"/>
-          <w:szCs w:val="24"/>
-        </w:rPr>
-      </w:pPr>
-      <w:r>
-        <w:rPr>
+          <w:b w:val="1"/>
+          <w:bCs w:val="1"/>
+          <w:sz w:val="24"/>
+          <w:szCs w:val="24"/>
+        </w:rPr>
+      </w:pPr>
+      <w:r>
+        <w:rPr>
+          <w:b w:val="1"/>
+          <w:bCs w:val="1"/>
           <w:sz w:val="24"/>
           <w:szCs w:val="24"/>
           <w:rtl w:val="0"/>
@@ -6591,7 +6627,7 @@
     <w:sdt>
       <w:sdtPr>
         <w:lock w:val="contentLocked"/>
-        <w:id w:val="706753558"/>
+        <w:id w:val="1912415580"/>
         <w:tag w:val="goog_rdk_3"/>
       </w:sdtPr>
       <w:sdtContent>
@@ -7141,9 +7177,8 @@
         <w:ind w:left="1440" w:right="0" w:hanging="360"/>
         <w:jc w:val="both"/>
         <w:rPr>
-          <w:rFonts w:ascii="Calibri" w:cs="Calibri" w:eastAsia="Calibri" w:hAnsi="Calibri"/>
-          <w:b w:val="0"/>
-          <w:bCs w:val="0"/>
+          <w:b w:val="1"/>
+          <w:bCs w:val="1"/>
           <w:i w:val="0"/>
           <w:iCs w:val="0"/>
           <w:smallCaps w:val="0"/>
@@ -7151,7 +7186,6 @@
           <w:color w:val="000000"/>
           <w:sz w:val="24"/>
           <w:szCs w:val="24"/>
-          <w:u w:val="none"/>
           <w:shd w:fill="auto" w:val="clear"/>
           <w:vertAlign w:val="baseline"/>
         </w:rPr>
@@ -7160,9 +7194,8 @@
       <w:bookmarkEnd w:id="7"/>
       <w:r>
         <w:rPr>
-          <w:rFonts w:ascii="Calibri" w:cs="Calibri" w:eastAsia="Calibri" w:hAnsi="Calibri"/>
-          <w:b w:val="0"/>
-          <w:bCs w:val="0"/>
+          <w:b w:val="1"/>
+          <w:bCs w:val="1"/>
           <w:i w:val="0"/>
           <w:iCs w:val="0"/>
           <w:smallCaps w:val="0"/>
@@ -7396,9 +7429,8 @@
         <w:ind w:left="1440" w:right="0" w:hanging="360"/>
         <w:jc w:val="both"/>
         <w:rPr>
-          <w:rFonts w:ascii="Calibri" w:cs="Calibri" w:eastAsia="Calibri" w:hAnsi="Calibri"/>
-          <w:b w:val="0"/>
-          <w:bCs w:val="0"/>
+          <w:b w:val="1"/>
+          <w:bCs w:val="1"/>
           <w:i w:val="0"/>
           <w:iCs w:val="0"/>
           <w:smallCaps w:val="0"/>
@@ -7406,7 +7438,6 @@
           <w:color w:val="000000"/>
           <w:sz w:val="24"/>
           <w:szCs w:val="24"/>
-          <w:u w:val="none"/>
           <w:shd w:fill="auto" w:val="clear"/>
           <w:vertAlign w:val="baseline"/>
         </w:rPr>
@@ -7415,9 +7446,8 @@
       <w:bookmarkEnd w:id="8"/>
       <w:r>
         <w:rPr>
-          <w:rFonts w:ascii="Calibri" w:cs="Calibri" w:eastAsia="Calibri" w:hAnsi="Calibri"/>
-          <w:b w:val="0"/>
-          <w:bCs w:val="0"/>
+          <w:b w:val="1"/>
+          <w:bCs w:val="1"/>
           <w:i w:val="0"/>
           <w:iCs w:val="0"/>
           <w:smallCaps w:val="0"/>
@@ -8018,9 +8048,8 @@
         <w:ind w:left="1440" w:right="0" w:hanging="360"/>
         <w:jc w:val="both"/>
         <w:rPr>
-          <w:rFonts w:ascii="Calibri" w:cs="Calibri" w:eastAsia="Calibri" w:hAnsi="Calibri"/>
-          <w:b w:val="0"/>
-          <w:bCs w:val="0"/>
+          <w:b w:val="1"/>
+          <w:bCs w:val="1"/>
           <w:i w:val="0"/>
           <w:iCs w:val="0"/>
           <w:smallCaps w:val="0"/>
@@ -8028,7 +8057,6 @@
           <w:color w:val="000000"/>
           <w:sz w:val="24"/>
           <w:szCs w:val="24"/>
-          <w:u w:val="none"/>
           <w:shd w:fill="auto" w:val="clear"/>
           <w:vertAlign w:val="baseline"/>
         </w:rPr>
@@ -8037,9 +8065,8 @@
       <w:bookmarkEnd w:id="9"/>
       <w:r>
         <w:rPr>
-          <w:rFonts w:ascii="Calibri" w:cs="Calibri" w:eastAsia="Calibri" w:hAnsi="Calibri"/>
-          <w:b w:val="0"/>
-          <w:bCs w:val="0"/>
+          <w:b w:val="1"/>
+          <w:bCs w:val="1"/>
           <w:i w:val="0"/>
           <w:iCs w:val="0"/>
           <w:smallCaps w:val="0"/>
@@ -8153,9 +8180,8 @@
         <w:ind w:left="1440" w:right="0" w:hanging="360"/>
         <w:jc w:val="both"/>
         <w:rPr>
-          <w:rFonts w:ascii="Calibri" w:cs="Calibri" w:eastAsia="Calibri" w:hAnsi="Calibri"/>
-          <w:b w:val="0"/>
-          <w:bCs w:val="0"/>
+          <w:b w:val="1"/>
+          <w:bCs w:val="1"/>
           <w:i w:val="0"/>
           <w:iCs w:val="0"/>
           <w:smallCaps w:val="0"/>
@@ -8163,7 +8189,6 @@
           <w:color w:val="000000"/>
           <w:sz w:val="24"/>
           <w:szCs w:val="24"/>
-          <w:u w:val="none"/>
           <w:shd w:fill="auto" w:val="clear"/>
           <w:vertAlign w:val="baseline"/>
         </w:rPr>
@@ -8172,9 +8197,8 @@
       <w:bookmarkEnd w:id="10"/>
       <w:r>
         <w:rPr>
-          <w:rFonts w:ascii="Calibri" w:cs="Calibri" w:eastAsia="Calibri" w:hAnsi="Calibri"/>
-          <w:b w:val="0"/>
-          <w:bCs w:val="0"/>
+          <w:b w:val="1"/>
+          <w:bCs w:val="1"/>
           <w:i w:val="0"/>
           <w:iCs w:val="0"/>
           <w:smallCaps w:val="0"/>
@@ -8269,9 +8293,8 @@
         <w:ind w:left="720" w:right="0" w:hanging="360"/>
         <w:jc w:val="both"/>
         <w:rPr>
-          <w:rFonts w:ascii="Calibri" w:cs="Calibri" w:eastAsia="Calibri" w:hAnsi="Calibri"/>
-          <w:b w:val="0"/>
-          <w:bCs w:val="0"/>
+          <w:b w:val="1"/>
+          <w:bCs w:val="1"/>
           <w:i w:val="0"/>
           <w:iCs w:val="0"/>
           <w:smallCaps w:val="0"/>
@@ -8279,7 +8302,6 @@
           <w:color w:val="000000"/>
           <w:sz w:val="24"/>
           <w:szCs w:val="24"/>
-          <w:u w:val="none"/>
           <w:shd w:fill="auto" w:val="clear"/>
           <w:vertAlign w:val="baseline"/>
         </w:rPr>
@@ -8288,9 +8310,8 @@
       <w:bookmarkEnd w:id="11"/>
       <w:r>
         <w:rPr>
-          <w:rFonts w:ascii="Calibri" w:cs="Calibri" w:eastAsia="Calibri" w:hAnsi="Calibri"/>
-          <w:b w:val="0"/>
-          <w:bCs w:val="0"/>
+          <w:b w:val="1"/>
+          <w:bCs w:val="1"/>
           <w:i w:val="0"/>
           <w:iCs w:val="0"/>
           <w:smallCaps w:val="0"/>
@@ -8319,12 +8340,16 @@
         <w:ind w:left="1440" w:hanging="360"/>
         <w:jc w:val="both"/>
         <w:rPr>
-          <w:sz w:val="24"/>
-          <w:szCs w:val="24"/>
-        </w:rPr>
-      </w:pPr>
-      <w:r>
-        <w:rPr>
+          <w:b w:val="1"/>
+          <w:bCs w:val="1"/>
+          <w:sz w:val="24"/>
+          <w:szCs w:val="24"/>
+        </w:rPr>
+      </w:pPr>
+      <w:r>
+        <w:rPr>
+          <w:b w:val="1"/>
+          <w:bCs w:val="1"/>
           <w:sz w:val="24"/>
           <w:szCs w:val="24"/>
           <w:rtl w:val="0"/>
@@ -8345,12 +8370,16 @@
         <w:ind w:left="2160" w:hanging="360"/>
         <w:jc w:val="both"/>
         <w:rPr>
-          <w:sz w:val="24"/>
-          <w:szCs w:val="24"/>
-        </w:rPr>
-      </w:pPr>
-      <w:r>
-        <w:rPr>
+          <w:b w:val="1"/>
+          <w:bCs w:val="1"/>
+          <w:sz w:val="24"/>
+          <w:szCs w:val="24"/>
+        </w:rPr>
+      </w:pPr>
+      <w:r>
+        <w:rPr>
+          <w:b w:val="1"/>
+          <w:bCs w:val="1"/>
           <w:sz w:val="24"/>
           <w:szCs w:val="24"/>
           <w:rtl w:val="0"/>
@@ -8802,7 +8831,7 @@
     <w:sdt>
       <w:sdtPr>
         <w:lock w:val="contentLocked"/>
-        <w:id w:val="-1102789760"/>
+        <w:id w:val="386682291"/>
         <w:tag w:val="goog_rdk_4"/>
       </w:sdtPr>
       <w:sdtContent>

</xml_diff>